<commit_message>
Acta con plantilla oficial, patrocinadores Texmo y Pan Menesa, y mejoras de gestión.
Rellena el acta desde la plantilla Kolosaurios, amplía el plazo de fichas hasta el 4/6 a las 17:00, corrige el acceso del manager Blue Flow por email, y añade banners rotativos aleatorios cada 3s.

Co-authored-by: Cursor <cursoragent@cursor.com>
</commit_message>
<xml_diff>
--- a/public/templates/acta-playa_kolosaurios.docx
+++ b/public/templates/acta-playa_kolosaurios.docx
@@ -48852,12 +48852,12 @@
           <wp:extent cx="778827" cy="778827"/>
           <wp:effectExtent b="0" l="0" r="0" t="0"/>
           <wp:wrapNone/>
-          <wp:docPr id="7" name="image2.jpg"/>
+          <wp:docPr id="7" name="image1.jpg"/>
           <a:graphic>
             <a:graphicData uri="http://schemas.openxmlformats.org/drawingml/2006/picture">
               <pic:pic>
                 <pic:nvPicPr>
-                  <pic:cNvPr id="0" name="image2.jpg"/>
+                  <pic:cNvPr id="0" name="image1.jpg"/>
                   <pic:cNvPicPr preferRelativeResize="0"/>
                 </pic:nvPicPr>
                 <pic:blipFill>
@@ -48936,12 +48936,12 @@
           <wp:extent cx="841199" cy="841199"/>
           <wp:effectExtent b="0" l="0" r="0" t="0"/>
           <wp:wrapNone/>
-          <wp:docPr id="5" name="image1.png"/>
+          <wp:docPr id="5" name="image2.png"/>
           <a:graphic>
             <a:graphicData uri="http://schemas.openxmlformats.org/drawingml/2006/picture">
               <pic:pic>
                 <pic:nvPicPr>
-                  <pic:cNvPr id="0" name="image1.png"/>
+                  <pic:cNvPr id="0" name="image2.png"/>
                   <pic:cNvPicPr preferRelativeResize="0"/>
                 </pic:nvPicPr>
                 <pic:blipFill>

</xml_diff>

<commit_message>
Actas PDF HTML, Excel de jugadores y panel en directo en inicio.
Sustituye el DOCX poco fiable por PDF desde la plantilla Kolosaurios (1 pagina, equipo local/visitante, logos de cabecera). Anade exportacion Excel de todos los jugadores en Admin y el panel de partidos en directo en la home del fin de semana.

Co-authored-by: Cursor <cursoragent@cursor.com>
</commit_message>
<xml_diff>
--- a/public/templates/acta-playa_kolosaurios.docx
+++ b/public/templates/acta-playa_kolosaurios.docx
@@ -17,12 +17,8 @@
         <w:sectPr>
           <w:headerReference r:id="rId6" w:type="default"/>
           <w:pgSz w:h="16840" w:w="11910" w:orient="portrait"/>
-          <w:pgMar w:bottom="280" w:top="540" w:left="566" w:right="566" w:header="360" w:footer="360"/>
+          <w:pgMar w:bottom="120" w:top="220" w:left="340" w:right="340" w:header="180" w:footer="120"/>
           <w:pgNumType w:start="1"/>
-          <w:cols w:equalWidth="0" w:num="2">
-            <w:col w:space="9333.45" w:w="720.02"/>
-            <w:col w:space="0" w:w="720.02"/>
-          </w:cols>
         </w:sectPr>
       </w:pPr>
       <w:r>
@@ -643,8 +639,8 @@
       </w:tblGrid>
       <w:tr>
         <w:trPr>
-          <w:cantSplit w:val="0"/>
-          <w:trHeight w:val="240" w:hRule="atLeast"/>
+          <w:cantSplit w:val="1"/>
+          <w:trHeight w:val="146" w:hRule="exact"/>
           <w:tblHeader w:val="0"/>
         </w:trPr>
         <w:tc>
@@ -714,8 +710,8 @@
       </w:tr>
       <w:tr>
         <w:trPr>
-          <w:cantSplit w:val="0"/>
-          <w:trHeight w:val="180" w:hRule="atLeast"/>
+          <w:cantSplit w:val="1"/>
+          <w:trHeight w:val="120" w:hRule="exact"/>
           <w:tblHeader w:val="0"/>
         </w:trPr>
         <w:tc>
@@ -1297,8 +1293,8 @@
       </w:tr>
       <w:tr>
         <w:trPr>
-          <w:cantSplit w:val="0"/>
-          <w:trHeight w:val="231" w:hRule="atLeast"/>
+          <w:cantSplit w:val="1"/>
+          <w:trHeight w:val="140" w:hRule="exact"/>
           <w:tblHeader w:val="0"/>
         </w:trPr>
         <w:tc>
@@ -1539,8 +1535,8 @@
       </w:tr>
       <w:tr>
         <w:trPr>
-          <w:cantSplit w:val="0"/>
-          <w:trHeight w:val="75" w:hRule="atLeast"/>
+          <w:cantSplit w:val="1"/>
+          <w:trHeight w:val="120" w:hRule="exact"/>
           <w:tblHeader w:val="0"/>
         </w:trPr>
         <w:tc>
@@ -1613,8 +1609,8 @@
       </w:tr>
       <w:tr>
         <w:trPr>
-          <w:cantSplit w:val="0"/>
-          <w:trHeight w:val="240" w:hRule="atLeast"/>
+          <w:cantSplit w:val="1"/>
+          <w:trHeight w:val="146" w:hRule="exact"/>
           <w:tblHeader w:val="0"/>
         </w:trPr>
         <w:tc>
@@ -2004,8 +2000,8 @@
       </w:tr>
       <w:tr>
         <w:trPr>
-          <w:cantSplit w:val="0"/>
-          <w:trHeight w:val="180" w:hRule="atLeast"/>
+          <w:cantSplit w:val="1"/>
+          <w:trHeight w:val="120" w:hRule="exact"/>
           <w:tblHeader w:val="0"/>
         </w:trPr>
         <w:tc>
@@ -2187,8 +2183,8 @@
       </w:tr>
       <w:tr>
         <w:trPr>
-          <w:cantSplit w:val="0"/>
-          <w:trHeight w:val="154" w:hRule="atLeast"/>
+          <w:cantSplit w:val="1"/>
+          <w:trHeight w:val="120" w:hRule="exact"/>
           <w:tblHeader w:val="0"/>
         </w:trPr>
         <w:tc>
@@ -2424,8 +2420,8 @@
       </w:tr>
       <w:tr>
         <w:trPr>
-          <w:cantSplit w:val="0"/>
-          <w:trHeight w:val="154" w:hRule="atLeast"/>
+          <w:cantSplit w:val="1"/>
+          <w:trHeight w:val="120" w:hRule="exact"/>
           <w:tblHeader w:val="0"/>
         </w:trPr>
         <w:tc>
@@ -2655,8 +2651,8 @@
       </w:tr>
       <w:tr>
         <w:trPr>
-          <w:cantSplit w:val="0"/>
-          <w:trHeight w:val="340" w:hRule="atLeast"/>
+          <w:cantSplit w:val="1"/>
+          <w:trHeight w:val="207" w:hRule="exact"/>
           <w:tblHeader w:val="0"/>
         </w:trPr>
         <w:tc>
@@ -2840,8 +2836,8 @@
       </w:tr>
       <w:tr>
         <w:trPr>
-          <w:cantSplit w:val="0"/>
-          <w:trHeight w:val="85" w:hRule="atLeast"/>
+          <w:cantSplit w:val="1"/>
+          <w:trHeight w:val="120" w:hRule="exact"/>
           <w:tblHeader w:val="0"/>
         </w:trPr>
         <w:tc>
@@ -2896,8 +2892,8 @@
       </w:tr>
       <w:tr>
         <w:trPr>
-          <w:cantSplit w:val="0"/>
-          <w:trHeight w:val="205" w:hRule="atLeast"/>
+          <w:cantSplit w:val="1"/>
+          <w:trHeight w:val="125" w:hRule="exact"/>
           <w:tblHeader w:val="0"/>
         </w:trPr>
         <w:tc>
@@ -3303,8 +3299,8 @@
       </w:tr>
       <w:tr>
         <w:trPr>
-          <w:cantSplit w:val="0"/>
-          <w:trHeight w:val="213" w:hRule="atLeast"/>
+          <w:cantSplit w:val="1"/>
+          <w:trHeight w:val="129" w:hRule="exact"/>
           <w:tblHeader w:val="0"/>
         </w:trPr>
         <w:tc>
@@ -4700,8 +4696,8 @@
       </w:tr>
       <w:tr>
         <w:trPr>
-          <w:cantSplit w:val="0"/>
-          <w:trHeight w:val="220" w:hRule="atLeast"/>
+          <w:cantSplit w:val="1"/>
+          <w:trHeight w:val="134" w:hRule="exact"/>
           <w:tblHeader w:val="0"/>
         </w:trPr>
         <w:tc>
@@ -5847,8 +5843,8 @@
       </w:tr>
       <w:tr>
         <w:trPr>
-          <w:cantSplit w:val="0"/>
-          <w:trHeight w:val="220" w:hRule="atLeast"/>
+          <w:cantSplit w:val="1"/>
+          <w:trHeight w:val="134" w:hRule="exact"/>
           <w:tblHeader w:val="0"/>
         </w:trPr>
         <w:tc>
@@ -6994,8 +6990,8 @@
       </w:tr>
       <w:tr>
         <w:trPr>
-          <w:cantSplit w:val="0"/>
-          <w:trHeight w:val="220" w:hRule="atLeast"/>
+          <w:cantSplit w:val="1"/>
+          <w:trHeight w:val="134" w:hRule="exact"/>
           <w:tblHeader w:val="0"/>
         </w:trPr>
         <w:tc>
@@ -8141,8 +8137,8 @@
       </w:tr>
       <w:tr>
         <w:trPr>
-          <w:cantSplit w:val="0"/>
-          <w:trHeight w:val="220" w:hRule="atLeast"/>
+          <w:cantSplit w:val="1"/>
+          <w:trHeight w:val="134" w:hRule="exact"/>
           <w:tblHeader w:val="0"/>
         </w:trPr>
         <w:tc>
@@ -9288,8 +9284,8 @@
       </w:tr>
       <w:tr>
         <w:trPr>
-          <w:cantSplit w:val="0"/>
-          <w:trHeight w:val="205" w:hRule="atLeast"/>
+          <w:cantSplit w:val="1"/>
+          <w:trHeight w:val="125" w:hRule="exact"/>
           <w:tblHeader w:val="0"/>
         </w:trPr>
         <w:tc>
@@ -10435,8 +10431,8 @@
       </w:tr>
       <w:tr>
         <w:trPr>
-          <w:cantSplit w:val="0"/>
-          <w:trHeight w:val="205" w:hRule="atLeast"/>
+          <w:cantSplit w:val="1"/>
+          <w:trHeight w:val="125" w:hRule="exact"/>
           <w:tblHeader w:val="0"/>
         </w:trPr>
         <w:tc>
@@ -11582,8 +11578,8 @@
       </w:tr>
       <w:tr>
         <w:trPr>
-          <w:cantSplit w:val="0"/>
-          <w:trHeight w:val="220" w:hRule="atLeast"/>
+          <w:cantSplit w:val="1"/>
+          <w:trHeight w:val="134" w:hRule="exact"/>
           <w:tblHeader w:val="0"/>
         </w:trPr>
         <w:tc>
@@ -12729,8 +12725,8 @@
       </w:tr>
       <w:tr>
         <w:trPr>
-          <w:cantSplit w:val="0"/>
-          <w:trHeight w:val="220" w:hRule="atLeast"/>
+          <w:cantSplit w:val="1"/>
+          <w:trHeight w:val="134" w:hRule="exact"/>
           <w:tblHeader w:val="0"/>
         </w:trPr>
         <w:tc>
@@ -13876,8 +13872,8 @@
       </w:tr>
       <w:tr>
         <w:trPr>
-          <w:cantSplit w:val="0"/>
-          <w:trHeight w:val="220" w:hRule="atLeast"/>
+          <w:cantSplit w:val="1"/>
+          <w:trHeight w:val="134" w:hRule="exact"/>
           <w:tblHeader w:val="0"/>
         </w:trPr>
         <w:tc>
@@ -15023,8 +15019,8 @@
       </w:tr>
       <w:tr>
         <w:trPr>
-          <w:cantSplit w:val="0"/>
-          <w:trHeight w:val="205" w:hRule="atLeast"/>
+          <w:cantSplit w:val="1"/>
+          <w:trHeight w:val="125" w:hRule="exact"/>
           <w:tblHeader w:val="0"/>
         </w:trPr>
         <w:tc>
@@ -16170,8 +16166,8 @@
       </w:tr>
       <w:tr>
         <w:trPr>
-          <w:cantSplit w:val="0"/>
-          <w:trHeight w:val="198" w:hRule="atLeast"/>
+          <w:cantSplit w:val="1"/>
+          <w:trHeight w:val="120" w:hRule="exact"/>
           <w:tblHeader w:val="0"/>
         </w:trPr>
         <w:tc>
@@ -17126,8 +17122,8 @@
       </w:tr>
       <w:tr>
         <w:trPr>
-          <w:cantSplit w:val="0"/>
-          <w:trHeight w:val="205" w:hRule="atLeast"/>
+          <w:cantSplit w:val="1"/>
+          <w:trHeight w:val="125" w:hRule="exact"/>
           <w:tblHeader w:val="0"/>
         </w:trPr>
         <w:tc>
@@ -18060,8 +18056,8 @@
       </w:tr>
       <w:tr>
         <w:trPr>
-          <w:cantSplit w:val="0"/>
-          <w:trHeight w:val="205" w:hRule="atLeast"/>
+          <w:cantSplit w:val="1"/>
+          <w:trHeight w:val="125" w:hRule="exact"/>
           <w:tblHeader w:val="0"/>
         </w:trPr>
         <w:tc>
@@ -19008,8 +19004,8 @@
       </w:tr>
       <w:tr>
         <w:trPr>
-          <w:cantSplit w:val="0"/>
-          <w:trHeight w:val="205" w:hRule="atLeast"/>
+          <w:cantSplit w:val="1"/>
+          <w:trHeight w:val="125" w:hRule="exact"/>
           <w:tblHeader w:val="0"/>
         </w:trPr>
         <w:tc>
@@ -19956,8 +19952,8 @@
       </w:tr>
       <w:tr>
         <w:trPr>
-          <w:cantSplit w:val="0"/>
-          <w:trHeight w:val="203" w:hRule="atLeast"/>
+          <w:cantSplit w:val="1"/>
+          <w:trHeight w:val="123" w:hRule="exact"/>
           <w:tblHeader w:val="0"/>
         </w:trPr>
         <w:tc>
@@ -20898,8 +20894,8 @@
       </w:tr>
       <w:tr>
         <w:trPr>
-          <w:cantSplit w:val="0"/>
-          <w:trHeight w:val="206" w:hRule="atLeast"/>
+          <w:cantSplit w:val="1"/>
+          <w:trHeight w:val="126" w:hRule="exact"/>
           <w:tblHeader w:val="0"/>
         </w:trPr>
         <w:tc>
@@ -22001,8 +21997,8 @@
       </w:tr>
       <w:tr>
         <w:trPr>
-          <w:cantSplit w:val="0"/>
-          <w:trHeight w:val="204" w:hRule="atLeast"/>
+          <w:cantSplit w:val="1"/>
+          <w:trHeight w:val="124" w:hRule="exact"/>
           <w:tblHeader w:val="0"/>
         </w:trPr>
         <w:tc>
@@ -22973,8 +22969,8 @@
       </w:tr>
       <w:tr>
         <w:trPr>
-          <w:cantSplit w:val="0"/>
-          <w:trHeight w:val="205" w:hRule="atLeast"/>
+          <w:cantSplit w:val="1"/>
+          <w:trHeight w:val="125" w:hRule="exact"/>
           <w:tblHeader w:val="0"/>
         </w:trPr>
         <w:tc>
@@ -23677,8 +23673,8 @@
       </w:tr>
       <w:tr>
         <w:trPr>
-          <w:cantSplit w:val="0"/>
-          <w:trHeight w:val="206" w:hRule="atLeast"/>
+          <w:cantSplit w:val="1"/>
+          <w:trHeight w:val="126" w:hRule="exact"/>
           <w:tblHeader w:val="0"/>
         </w:trPr>
         <w:tc>
@@ -24689,8 +24685,8 @@
       </w:tr>
       <w:tr>
         <w:trPr>
-          <w:cantSplit w:val="0"/>
-          <w:trHeight w:val="205" w:hRule="atLeast"/>
+          <w:cantSplit w:val="1"/>
+          <w:trHeight w:val="125" w:hRule="exact"/>
           <w:tblHeader w:val="0"/>
         </w:trPr>
         <w:tc>
@@ -25623,8 +25619,8 @@
       </w:tr>
       <w:tr>
         <w:trPr>
-          <w:cantSplit w:val="0"/>
-          <w:trHeight w:val="205" w:hRule="atLeast"/>
+          <w:cantSplit w:val="1"/>
+          <w:trHeight w:val="125" w:hRule="exact"/>
           <w:tblHeader w:val="0"/>
         </w:trPr>
         <w:tc>
@@ -26576,8 +26572,8 @@
       </w:tr>
       <w:tr>
         <w:trPr>
-          <w:cantSplit w:val="0"/>
-          <w:trHeight w:val="205" w:hRule="atLeast"/>
+          <w:cantSplit w:val="1"/>
+          <w:trHeight w:val="125" w:hRule="exact"/>
           <w:tblHeader w:val="0"/>
         </w:trPr>
         <w:tc>
@@ -27510,8 +27506,8 @@
       </w:tr>
       <w:tr>
         <w:trPr>
-          <w:cantSplit w:val="0"/>
-          <w:trHeight w:val="205" w:hRule="atLeast"/>
+          <w:cantSplit w:val="1"/>
+          <w:trHeight w:val="125" w:hRule="exact"/>
           <w:tblHeader w:val="0"/>
         </w:trPr>
         <w:tc>
@@ -28444,8 +28440,8 @@
       </w:tr>
       <w:tr>
         <w:trPr>
-          <w:cantSplit w:val="0"/>
-          <w:trHeight w:val="205" w:hRule="atLeast"/>
+          <w:cantSplit w:val="1"/>
+          <w:trHeight w:val="125" w:hRule="exact"/>
           <w:tblHeader w:val="0"/>
         </w:trPr>
         <w:tc>
@@ -29378,8 +29374,8 @@
       </w:tr>
       <w:tr>
         <w:trPr>
-          <w:cantSplit w:val="0"/>
-          <w:trHeight w:val="205" w:hRule="atLeast"/>
+          <w:cantSplit w:val="1"/>
+          <w:trHeight w:val="125" w:hRule="exact"/>
           <w:tblHeader w:val="0"/>
         </w:trPr>
         <w:tc>
@@ -30312,8 +30308,8 @@
       </w:tr>
       <w:tr>
         <w:trPr>
-          <w:cantSplit w:val="0"/>
-          <w:trHeight w:val="205" w:hRule="atLeast"/>
+          <w:cantSplit w:val="1"/>
+          <w:trHeight w:val="125" w:hRule="exact"/>
           <w:tblHeader w:val="0"/>
         </w:trPr>
         <w:tc>
@@ -31265,8 +31261,8 @@
       </w:tr>
       <w:tr>
         <w:trPr>
-          <w:cantSplit w:val="0"/>
-          <w:trHeight w:val="205" w:hRule="atLeast"/>
+          <w:cantSplit w:val="1"/>
+          <w:trHeight w:val="125" w:hRule="exact"/>
           <w:tblHeader w:val="0"/>
         </w:trPr>
         <w:tc>
@@ -32199,8 +32195,8 @@
       </w:tr>
       <w:tr>
         <w:trPr>
-          <w:cantSplit w:val="0"/>
-          <w:trHeight w:val="205" w:hRule="atLeast"/>
+          <w:cantSplit w:val="1"/>
+          <w:trHeight w:val="125" w:hRule="exact"/>
           <w:tblHeader w:val="0"/>
         </w:trPr>
         <w:tc>
@@ -33133,8 +33129,8 @@
       </w:tr>
       <w:tr>
         <w:trPr>
-          <w:cantSplit w:val="0"/>
-          <w:trHeight w:val="205" w:hRule="atLeast"/>
+          <w:cantSplit w:val="1"/>
+          <w:trHeight w:val="125" w:hRule="exact"/>
           <w:tblHeader w:val="0"/>
         </w:trPr>
         <w:tc>
@@ -34067,8 +34063,8 @@
       </w:tr>
       <w:tr>
         <w:trPr>
-          <w:cantSplit w:val="0"/>
-          <w:trHeight w:val="205" w:hRule="atLeast"/>
+          <w:cantSplit w:val="1"/>
+          <w:trHeight w:val="125" w:hRule="exact"/>
           <w:tblHeader w:val="0"/>
         </w:trPr>
         <w:tc>
@@ -35001,8 +34997,8 @@
       </w:tr>
       <w:tr>
         <w:trPr>
-          <w:cantSplit w:val="0"/>
-          <w:trHeight w:val="205" w:hRule="atLeast"/>
+          <w:cantSplit w:val="1"/>
+          <w:trHeight w:val="125" w:hRule="exact"/>
           <w:tblHeader w:val="0"/>
         </w:trPr>
         <w:tc>
@@ -35936,8 +35932,8 @@
       </w:tr>
       <w:tr>
         <w:trPr>
-          <w:cantSplit w:val="0"/>
-          <w:trHeight w:val="205" w:hRule="atLeast"/>
+          <w:cantSplit w:val="1"/>
+          <w:trHeight w:val="125" w:hRule="exact"/>
           <w:tblHeader w:val="0"/>
         </w:trPr>
         <w:tc>
@@ -36885,8 +36881,8 @@
       </w:tr>
       <w:tr>
         <w:trPr>
-          <w:cantSplit w:val="0"/>
-          <w:trHeight w:val="205" w:hRule="atLeast"/>
+          <w:cantSplit w:val="1"/>
+          <w:trHeight w:val="125" w:hRule="exact"/>
           <w:tblHeader w:val="0"/>
         </w:trPr>
         <w:tc>
@@ -37834,8 +37830,8 @@
       </w:tr>
       <w:tr>
         <w:trPr>
-          <w:cantSplit w:val="0"/>
-          <w:trHeight w:val="203" w:hRule="atLeast"/>
+          <w:cantSplit w:val="1"/>
+          <w:trHeight w:val="123" w:hRule="exact"/>
           <w:tblHeader w:val="0"/>
         </w:trPr>
         <w:tc>
@@ -38777,8 +38773,8 @@
       </w:tr>
       <w:tr>
         <w:trPr>
-          <w:cantSplit w:val="0"/>
-          <w:trHeight w:val="206" w:hRule="atLeast"/>
+          <w:cantSplit w:val="1"/>
+          <w:trHeight w:val="126" w:hRule="exact"/>
           <w:tblHeader w:val="0"/>
         </w:trPr>
         <w:tc>
@@ -39862,8 +39858,8 @@
       </w:tr>
       <w:tr>
         <w:trPr>
-          <w:cantSplit w:val="0"/>
-          <w:trHeight w:val="204" w:hRule="atLeast"/>
+          <w:cantSplit w:val="1"/>
+          <w:trHeight w:val="124" w:hRule="exact"/>
           <w:tblHeader w:val="0"/>
         </w:trPr>
         <w:tc>
@@ -40835,8 +40831,8 @@
       </w:tr>
       <w:tr>
         <w:trPr>
-          <w:cantSplit w:val="0"/>
-          <w:trHeight w:val="206" w:hRule="atLeast"/>
+          <w:cantSplit w:val="1"/>
+          <w:trHeight w:val="126" w:hRule="exact"/>
           <w:tblHeader w:val="0"/>
         </w:trPr>
         <w:tc>
@@ -41824,8 +41820,8 @@
       </w:tr>
       <w:tr>
         <w:trPr>
-          <w:cantSplit w:val="0"/>
-          <w:trHeight w:val="203" w:hRule="atLeast"/>
+          <w:cantSplit w:val="1"/>
+          <w:trHeight w:val="123" w:hRule="exact"/>
           <w:tblHeader w:val="0"/>
         </w:trPr>
         <w:tc>
@@ -42813,8 +42809,8 @@
       </w:tr>
       <w:tr>
         <w:trPr>
-          <w:cantSplit w:val="0"/>
-          <w:trHeight w:val="206" w:hRule="atLeast"/>
+          <w:cantSplit w:val="1"/>
+          <w:trHeight w:val="126" w:hRule="exact"/>
           <w:tblHeader w:val="0"/>
         </w:trPr>
         <w:tc>
@@ -43835,8 +43831,8 @@
       </w:tr>
       <w:tr>
         <w:trPr>
-          <w:cantSplit w:val="0"/>
-          <w:trHeight w:val="203" w:hRule="atLeast"/>
+          <w:cantSplit w:val="1"/>
+          <w:trHeight w:val="123" w:hRule="exact"/>
           <w:tblHeader w:val="0"/>
         </w:trPr>
         <w:tc>
@@ -44743,8 +44739,8 @@
       </w:tr>
       <w:tr>
         <w:trPr>
-          <w:cantSplit w:val="0"/>
-          <w:trHeight w:val="206" w:hRule="atLeast"/>
+          <w:cantSplit w:val="1"/>
+          <w:trHeight w:val="126" w:hRule="exact"/>
           <w:tblHeader w:val="0"/>
         </w:trPr>
         <w:tc>
@@ -45732,8 +45728,8 @@
       </w:tr>
       <w:tr>
         <w:trPr>
-          <w:cantSplit w:val="0"/>
-          <w:trHeight w:val="204" w:hRule="atLeast"/>
+          <w:cantSplit w:val="1"/>
+          <w:trHeight w:val="124" w:hRule="exact"/>
           <w:tblHeader w:val="0"/>
         </w:trPr>
         <w:tc>
@@ -46721,8 +46717,8 @@
       </w:tr>
       <w:tr>
         <w:trPr>
-          <w:cantSplit w:val="0"/>
-          <w:trHeight w:val="206" w:hRule="atLeast"/>
+          <w:cantSplit w:val="1"/>
+          <w:trHeight w:val="126" w:hRule="exact"/>
           <w:tblHeader w:val="0"/>
         </w:trPr>
         <w:tc>
@@ -47743,8 +47739,8 @@
       </w:tr>
       <w:tr>
         <w:trPr>
-          <w:cantSplit w:val="0"/>
-          <w:trHeight w:val="204" w:hRule="atLeast"/>
+          <w:cantSplit w:val="1"/>
+          <w:trHeight w:val="124" w:hRule="exact"/>
           <w:tblHeader w:val="0"/>
         </w:trPr>
         <w:tc>
@@ -48643,8 +48639,8 @@
       </w:tr>
       <w:tr>
         <w:trPr>
-          <w:cantSplit w:val="0"/>
-          <w:trHeight w:val="200" w:hRule="atLeast"/>
+          <w:cantSplit w:val="1"/>
+          <w:trHeight w:val="122" w:hRule="exact"/>
           <w:tblHeader w:val="0"/>
         </w:trPr>
         <w:tc>
@@ -48699,8 +48695,8 @@
       </w:tr>
       <w:tr>
         <w:trPr>
-          <w:cantSplit w:val="0"/>
-          <w:trHeight w:val="190" w:hRule="atLeast"/>
+          <w:cantSplit w:val="1"/>
+          <w:trHeight w:val="120" w:hRule="exact"/>
           <w:tblHeader w:val="0"/>
         </w:trPr>
         <w:tc>
@@ -48811,7 +48807,7 @@
     <w:sectPr>
       <w:type w:val="continuous"/>
       <w:pgSz w:h="16840" w:w="11910" w:orient="portrait"/>
-      <w:pgMar w:bottom="280" w:top="540" w:left="566" w:right="566" w:header="360" w:footer="360"/>
+      <w:pgMar w:bottom="120" w:top="220" w:left="340" w:right="340" w:header="180" w:footer="120"/>
     </w:sectPr>
   </w:body>
 </w:document>

</xml_diff>